<commit_message>
Genera la solución del taller con los datos de cada laboratorio
Cada laboratorio toma sus propios datos, así que generar_solucion.py recibe
b, h, L, masas y flechas por línea de comandos y redacta comparación y
conclusiones según los resultados obtenidos.

Co-Authored-By: Claude Opus 5.5 <noreply@anthropic.com>
Claude-Session: https://claude.ai/code/session_01EwW5SdpFdcaZozTeTFtc6Z
</commit_message>
<xml_diff>
--- a/viga-voladizo/solucion/Taller3_Viga_Voladiza_RESUELTO.docx
+++ b/viga-voladizo/solucion/Taller3_Viga_Voladiza_RESUELTO.docx
@@ -134,7 +134,7 @@
                 <w:b/>
                 <w:sz w:val="20"/>
               </w:rPr>
-              <w:t>SOLUCIÓN MODELO / PAUTA DOCENTE</w:t>
+              <w:t>SOLUCIÓN DESARROLLADA / REFERENCIA DOCENTE</w:t>
             </w:r>
           </w:p>
         </w:tc>
@@ -157,7 +157,7 @@
                 <w:b w:val="0"/>
                 <w:sz w:val="20"/>
               </w:rPr>
-              <w:t>Datos experimentales ilustrativos (regla de acero)</w:t>
+              <w:t>Datos de ejemplo (regla de acero)</w:t>
             </w:r>
           </w:p>
         </w:tc>
@@ -1587,7 +1587,7 @@
                 <w:b w:val="0"/>
                 <w:sz w:val="20"/>
               </w:rPr>
-              <w:t>0,00080 m</w:t>
+              <w:t>0,000800 m</w:t>
             </w:r>
           </w:p>
         </w:tc>
@@ -5550,7 +5550,7 @@
                 <w:b w:val="0"/>
                 <w:sz w:val="20"/>
               </w:rPr>
-              <w:t>Datos de la Tabla 1: ancho b = 0,0250 m (pie de metro, ±0,02 mm), espesor h = 0,00080 m (micrómetro, ±0,01 mm) y longitud libre L = 0,250 m (huincha, ±1 mm, medida desde el borde del empotramiento hasta el punto donde cuelga la masa).</w:t>
+              <w:t>Datos de la Tabla 1: ancho b = 0,0250 m, espesor h = 0,000800 m y longitud libre L = 0,250 m (medida desde el borde del empotramiento hasta el punto donde cuelga la masa).</w:t>
             </w:r>
           </w:p>
           <w:p>
@@ -5601,7 +5601,7 @@
                 <w:b w:val="0"/>
                 <w:sz w:val="22"/>
               </w:rPr>
-              <w:t>I = (1/12)·(0,0250 m)·(0,00080 m)</w:t>
+              <w:t>I = (1/12)·(0,0250 m)·(0,000800 m)</w:t>
             </w:r>
             <w:r>
               <w:rPr>
@@ -5618,7 +5618,7 @@
                 <w:b w:val="0"/>
                 <w:sz w:val="22"/>
               </w:rPr>
-              <w:t xml:space="preserve"> = (1/12)·(0,0250)·(5,12×10</w:t>
+              <w:t xml:space="preserve"> = (1/12)·(0,0250)·(5,120×10</w:t>
             </w:r>
             <w:r>
               <w:rPr>
@@ -6474,15 +6474,15 @@
                 <w:b/>
                 <w:sz w:val="20"/>
               </w:rPr>
-              <w:t>Intercepto n = 0,00003 m ≈ 0</w:t>
-            </w:r>
-            <w:r>
-              <w:rPr>
-                <w:rFonts w:ascii="Arial" w:hAnsi="Arial" w:cs="Arial"/>
-                <w:b w:val="0"/>
-                <w:sz w:val="20"/>
-              </w:rPr>
-              <w:t>: es la flecha cuando F = 0. Teóricamente es cero, porque la referencia se tomó en el extremo libre sin carga. Su valor (0,03 mm) es menor que la resolución de la regla graduada (0,5 mm), por lo que se atribuye a errores de lectura y no a un efecto físico.</w:t>
+              <w:t>Intercepto n = 0,00003 m</w:t>
+            </w:r>
+            <w:r>
+              <w:rPr>
+                <w:rFonts w:ascii="Arial" w:hAnsi="Arial" w:cs="Arial"/>
+                <w:b w:val="0"/>
+                <w:sz w:val="20"/>
+              </w:rPr>
+              <w:t>: es la flecha cuando F = 0. Teóricamente es cero, porque la referencia se tomó en el extremo libre sin carga. Su valor (0,03 mm) es pequeño frente a las flechas medidas y del orden de la resolución de la lectura, por lo que se atribuye a errores de lectura y no a un efecto físico.</w:t>
             </w:r>
           </w:p>
           <w:p>
@@ -7122,7 +7122,7 @@
                 <w:b w:val="0"/>
                 <w:sz w:val="20"/>
               </w:rPr>
-              <w:t xml:space="preserve"> = (193 ± 12) GPa. El término dominante es el del espesor (3Δh/h ≈ 3,8 %), porque h aparece al cubo.</w:t>
+              <w:t xml:space="preserve"> = (193 ± 12) GPa. El término dominante es el del espesor (3Δh/h ≈ 3,8 %, 3ΔL/L ≈ 1,2 %), porque h y L aparecen al cubo.</w:t>
             </w:r>
           </w:p>
         </w:tc>
@@ -7397,7 +7397,7 @@
                 <w:b w:val="0"/>
                 <w:sz w:val="20"/>
               </w:rPr>
-              <w:t xml:space="preserve"> Pa = 200 GPa (tablas de propiedades de materiales, p. ej. Serway &amp; Jewett, Física para ciencias e ingeniería; rango típico 190 a 210 GPa).</w:t>
+              <w:t xml:space="preserve"> Pa = 200 GPa; rango típico 190 a 210 GPa (tablas de propiedades de materiales, p. ej. Serway &amp; Jewett, Física para ciencias e ingeniería).</w:t>
             </w:r>
           </w:p>
           <w:p>
@@ -7515,7 +7515,7 @@
                 <w:b w:val="0"/>
                 <w:sz w:val="20"/>
               </w:rPr>
-              <w:t xml:space="preserve"> Pa), queda dentro del rango tabulado del acero y el valor teórico cae dentro del intervalo de incertidumbre experimental; se concluye que la regla es de acero y que el método es adecuado.</w:t>
+              <w:t xml:space="preserve"> Pa), queda dentro del rango tabulado del acero y el valor teórico cae dentro del intervalo de incertidumbre experimental, por lo que la diferencia es compatible con los errores de medición.</w:t>
             </w:r>
           </w:p>
           <w:p>
@@ -7543,7 +7543,7 @@
                 <w:b w:val="0"/>
                 <w:sz w:val="20"/>
               </w:rPr>
-              <w:t>• Medición del espesor h: un error de 0,01 mm en h produce ≈ 3,8 % de error en Y (dependencia h</w:t>
+              <w:t>• Medición del espesor h: su incertidumbre aporta ≈ 3,8 % de error en Y (dependencia h</w:t>
             </w:r>
             <w:r>
               <w:rPr>
@@ -7574,7 +7574,7 @@
                 <w:b w:val="0"/>
                 <w:sz w:val="20"/>
               </w:rPr>
-              <w:t>• Definición de L: debe medirse desde el borde de la mordaza hasta el punto de aplicación de la carga; 1 mm de error produce 1,2 % en Y (dependencia L</w:t>
+              <w:t>• Definición de L: debe medirse desde el borde de la mordaza hasta el punto de aplicación de la carga; su incertidumbre aporta ≈ 1,2 % en Y (dependencia L</w:t>
             </w:r>
             <w:r>
               <w:rPr>
@@ -7619,7 +7619,7 @@
                 <w:b w:val="0"/>
                 <w:sz w:val="20"/>
               </w:rPr>
-              <w:t>• Lectura de la flecha con error de paralaje y resolución de 0,5 mm; oscilación de la masa.</w:t>
+              <w:t>• Lectura de la flecha con error de paralaje y resolución limitada; oscilación de la masa.</w:t>
             </w:r>
           </w:p>
           <w:p>
@@ -8432,7 +8432,7 @@
                 <w:b w:val="0"/>
                 <w:sz w:val="20"/>
               </w:rPr>
-              <w:t>Del análisis de datos se concluye que la medición más crítica es el espesor h, seguida de la longitud L, por su dependencia cúbica; la incertidumbre estimada (≈ 6 %) es mayor que el error obtenido, por lo que la diferencia es atribuible a errores experimentales (principalmente medición de h y el giro de la mordaza, que tiende a subestimar Y). Para mejorar el resultado se propone medir h con micrómetro en varios puntos y promediar, asegurar firmemente el empotramiento y medir la flecha con un comparador o evitando el paralaje.</w:t>
+              <w:t>Del análisis de datos se concluye que las mediciones más críticas son el espesor h y la longitud L, por su dependencia cúbica; la incertidumbre estimada es ≈ 6 % y el error obtenido es 3,4 %, por lo que la diferencia es atribuible a errores experimentales. Para mejorar el resultado se propone medir h con micrómetro en varios puntos y promediar, asegurar firmemente el empotramiento y medir la flecha evitando el paralaje.</w:t>
             </w:r>
           </w:p>
           <w:p>
@@ -8446,7 +8446,7 @@
                 <w:b w:val="0"/>
                 <w:sz w:val="20"/>
               </w:rPr>
-              <w:t>Finalmente, el modelo de viga en voladizo es válido dentro de sus supuestos (material homogéneo y elástico, sección uniforme, peso propio despreciable y pequeñas deformaciones), los cuales se cumplieron en el experimento al mantener la flecha máxima por debajo del 10 % de L.</w:t>
+              <w:t>Finalmente, el modelo de viga en voladizo es válido dentro de sus supuestos (material homogéneo y elástico, sección uniforme, peso propio despreciable y pequeñas deformaciones), los cuales se cumplieron al mantener la flecha máxima en ≈ 10 % de L.</w:t>
             </w:r>
           </w:p>
         </w:tc>

</xml_diff>